<commit_message>
Add an introduction, architecture walkthrough and prepared client answers (how data comes in, infrastructure, encryption, security, what the AI is) to the platform summary, each saying what the demo does today so nothing is oversold
Co-Authored-By: Claude Opus 5.5 <noreply@anthropic.com>
</commit_message>
<xml_diff>
--- a/project-docs/Platform-Performance-at-Scale-Summary.docx
+++ b/project-docs/Platform-Performance-at-Scale-Summary.docx
@@ -27,7 +27,7 @@
           <w:sz w:val="28"/>
           <w:szCs w:val="28"/>
         </w:rPr>
-        <w:t xml:space="preserve">Performance at Scale, Infrastructure, Security and Hosting — Summary</w:t>
+        <w:t xml:space="preserve">Introduction, Client Answers, Performance at Scale, Security and Hosting — Summary</w:t>
       </w:r>
     </w:p>
     <w:p>
@@ -189,7 +189,22 @@
         <w:pStyle w:val="Heading1"/>
       </w:pPr>
       <w:r>
-        <w:t xml:space="preserve">2. Infrastructure</w:t>
+        <w:t xml:space="preserve">2. Introduction and architecture walkthrough</w:t>
+      </w:r>
+    </w:p>
+    <w:p>
+      <w:pPr>
+        <w:spacing w:after="160" w:before="60"/>
+      </w:pPr>
+      <w:r>
+        <w:rPr>
+          <w:i/>
+          <w:iCs/>
+          <w:color w:val="595959"/>
+          <w:sz w:val="18"/>
+          <w:szCs w:val="18"/>
+        </w:rPr>
+        <w:t xml:space="preserve">Spoken scripts for a client meeting. They describe the platform as designed; where the demo differs, a "Today in the demo" line says so — say it rather than let the client find it.</w:t>
       </w:r>
     </w:p>
     <w:p>
@@ -197,6 +212,676 @@
         <w:pStyle w:val="Heading2"/>
       </w:pPr>
       <w:r>
+        <w:t xml:space="preserve">2.1 The introduction (about 90 seconds)</w:t>
+      </w:r>
+    </w:p>
+    <w:p>
+      <w:pPr>
+        <w:pBdr>
+          <w:left w:val="single" w:color="1F4E79" w:sz="18" w:space="10"/>
+        </w:pBdr>
+        <w:spacing w:after="120"/>
+        <w:ind w:left="280"/>
+      </w:pPr>
+      <w:r>
+        <w:t xml:space="preserve">"What we've built is one platform for the bank's data, its regulatory ratios and its approvals.</w:t>
+      </w:r>
+    </w:p>
+    <w:p>
+      <w:pPr>
+        <w:pBdr>
+          <w:left w:val="single" w:color="1F4E79" w:sz="18" w:space="10"/>
+        </w:pBdr>
+        <w:spacing w:after="120"/>
+        <w:ind w:left="280"/>
+      </w:pPr>
+      <w:r>
+        <w:t xml:space="preserve">In one sentence: it collects the data from the bank's core systems, checks it, calculates the ratios the regulator and the board watch, reconciles it against the bank's other systems, and sends every exception to the right person for a decision — with an audit trail behind every number.</w:t>
+      </w:r>
+    </w:p>
+    <w:p>
+      <w:pPr>
+        <w:pBdr>
+          <w:left w:val="single" w:color="1F4E79" w:sz="18" w:space="10"/>
+        </w:pBdr>
+        <w:spacing w:after="120"/>
+        <w:ind w:left="280"/>
+      </w:pPr>
+      <w:r>
+        <w:t xml:space="preserve">Five verbs, in order: </w:t>
+      </w:r>
+      <w:r>
+        <w:rPr>
+          <w:b/>
+          <w:bCs/>
+        </w:rPr>
+        <w:t xml:space="preserve">Collect. Check. Calculate. Reconcile. Approve.</w:t>
+      </w:r>
+      <w:r>
+        <w:t xml:space="preserve"> And a sixth running underneath all of them: </w:t>
+      </w:r>
+      <w:r>
+        <w:rPr>
+          <w:b/>
+          <w:bCs/>
+        </w:rPr>
+        <w:t xml:space="preserve">Audit.</w:t>
+      </w:r>
+    </w:p>
+    <w:p>
+      <w:pPr>
+        <w:pBdr>
+          <w:left w:val="single" w:color="1F4E79" w:sz="18" w:space="10"/>
+        </w:pBdr>
+        <w:spacing w:after="120"/>
+        <w:ind w:left="280"/>
+      </w:pPr>
+      <w:r>
+        <w:t xml:space="preserve">Three design rules shaped every decision. First, </w:t>
+      </w:r>
+      <w:r>
+        <w:rPr>
+          <w:b/>
+          <w:bCs/>
+        </w:rPr>
+        <w:t xml:space="preserve">every number can be traced</w:t>
+      </w:r>
+      <w:r>
+        <w:t xml:space="preserve">: click a figure on a regulatory return and you see the formula, the source table and how many records produced it. Second, </w:t>
+      </w:r>
+      <w:r>
+        <w:rPr>
+          <w:b/>
+          <w:bCs/>
+        </w:rPr>
+        <w:t xml:space="preserve">the software flags and people decide</w:t>
+      </w:r>
+      <w:r>
+        <w:t xml:space="preserve">: nothing is corrected or approved automatically — a maker prepares, a checker approves, and the CFO signs off each run. Third, </w:t>
+      </w:r>
+      <w:r>
+        <w:rPr>
+          <w:b/>
+          <w:bCs/>
+        </w:rPr>
+        <w:t xml:space="preserve">nothing is lost silently</w:t>
+      </w:r>
+      <w:r>
+        <w:t xml:space="preserve">: a rejected record is kept with its original row, and every run compares what each source sent with what was kept."</w:t>
+      </w:r>
+    </w:p>
+    <w:p>
+      <w:pPr>
+        <w:pStyle w:val="Heading2"/>
+      </w:pPr>
+      <w:r>
+        <w:t xml:space="preserve">2.2 The architecture (about 3 minutes, then let them ask)</w:t>
+      </w:r>
+    </w:p>
+    <w:p>
+      <w:pPr>
+        <w:pStyle w:val="ListParagraph"/>
+        <w:numPr>
+          <w:ilvl w:val="0"/>
+          <w:numId w:val="2"/>
+        </w:numPr>
+        <w:spacing w:after="60"/>
+      </w:pPr>
+      <w:r>
+        <w:rPr>
+          <w:b/>
+          <w:bCs/>
+        </w:rPr>
+        <w:t xml:space="preserve">Sources.</w:t>
+      </w:r>
+      <w:r>
+        <w:t xml:space="preserve"> Core-banking extracts — customers, accounts, loans, transactions, branches, capital, daily liquidity — per country; the CRM (Salesforce); connectors for databases and APIs; live FX rates. Every row is stamped with its source system, country and delivery batch, and the stamp is never removed.</w:t>
+      </w:r>
+    </w:p>
+    <w:p>
+      <w:pPr>
+        <w:pStyle w:val="ListParagraph"/>
+        <w:numPr>
+          <w:ilvl w:val="0"/>
+          <w:numId w:val="2"/>
+        </w:numPr>
+        <w:spacing w:after="60"/>
+      </w:pPr>
+      <w:r>
+        <w:rPr>
+          <w:b/>
+          <w:bCs/>
+        </w:rPr>
+        <w:t xml:space="preserve">Pipeline (Azure Databricks).</w:t>
+      </w:r>
+      <w:r>
+        <w:t xml:space="preserve"> Three layers: raw, cleaned, reporting. It standardises dates, numbers and currencies, applies corrections people have approved, runs 28 data-quality checks and 9 fraud and business rules, calculates the eight headline ratios and the portfolio, branch and scenario figures, and reconciles what each source sent against what was kept.</w:t>
+      </w:r>
+    </w:p>
+    <w:p>
+      <w:pPr>
+        <w:pStyle w:val="ListParagraph"/>
+        <w:numPr>
+          <w:ilvl w:val="0"/>
+          <w:numId w:val="2"/>
+        </w:numPr>
+        <w:spacing w:after="60"/>
+      </w:pPr>
+      <w:r>
+        <w:rPr>
+          <w:b/>
+          <w:bCs/>
+        </w:rPr>
+        <w:t xml:space="preserve">One database (PostgreSQL).</w:t>
+      </w:r>
+      <w:r>
+        <w:t xml:space="preserve"> Each run is loaded in a single all-or-nothing step, so the screens never show a half-loaded day. Standard open format — the bank's data is never locked into our product.</w:t>
+      </w:r>
+    </w:p>
+    <w:p>
+      <w:pPr>
+        <w:pStyle w:val="ListParagraph"/>
+        <w:numPr>
+          <w:ilvl w:val="0"/>
+          <w:numId w:val="2"/>
+        </w:numPr>
+        <w:spacing w:after="60"/>
+      </w:pPr>
+      <w:r>
+        <w:rPr>
+          <w:b/>
+          <w:bCs/>
+        </w:rPr>
+        <w:t xml:space="preserve">Screens, by role.</w:t>
+      </w:r>
+      <w:r>
+        <w:t xml:space="preserve"> Seven roles, each with its own home and menu: Executive Summary, Portfolio &amp; Credit Risk, Regulatory Reporting with drill-to-source and PDF/Excel export, Scenario Modelling that recalculates instantly in the browser, Branch &amp; Segment Performance, and Tasks and Audit. Screens read precomputed summaries, so they stay fast as data grows.</w:t>
+      </w:r>
+    </w:p>
+    <w:p>
+      <w:pPr>
+        <w:pStyle w:val="ListParagraph"/>
+        <w:numPr>
+          <w:ilvl w:val="0"/>
+          <w:numId w:val="2"/>
+        </w:numPr>
+        <w:spacing w:after="60"/>
+      </w:pPr>
+      <w:r>
+        <w:rPr>
+          <w:b/>
+          <w:bCs/>
+        </w:rPr>
+        <w:t xml:space="preserve">Workflow (Camunda).</w:t>
+      </w:r>
+      <w:r>
+        <w:t xml:space="preserve"> Every exception — a failed check, a fraud case, a limit breach, a possible duplicate, a difference with another system — becomes a task with an owner, a severity and a due date. Maker-checker rules apply, the CFO approves the important items, and each run is signed off.</w:t>
+      </w:r>
+    </w:p>
+    <w:p>
+      <w:pPr>
+        <w:pStyle w:val="ListParagraph"/>
+        <w:numPr>
+          <w:ilvl w:val="0"/>
+          <w:numId w:val="2"/>
+        </w:numPr>
+        <w:spacing w:after="60"/>
+      </w:pPr>
+      <w:r>
+        <w:rPr>
+          <w:b/>
+          <w:bCs/>
+        </w:rPr>
+        <w:t xml:space="preserve">Assistant.</w:t>
+      </w:r>
+      <w:r>
+        <w:t xml:space="preserve"> A language model running on the bank's own hardware answers plain-language questions by choosing from an approved list of queries; it never writes SQL and never produces a number itself.</w:t>
+      </w:r>
+    </w:p>
+    <w:p>
+      <w:pPr>
+        <w:pStyle w:val="ListParagraph"/>
+        <w:numPr>
+          <w:ilvl w:val="0"/>
+          <w:numId w:val="2"/>
+        </w:numPr>
+        <w:spacing w:after="60"/>
+      </w:pPr>
+      <w:r>
+        <w:rPr>
+          <w:b/>
+          <w:bCs/>
+        </w:rPr>
+        <w:t xml:space="preserve">Audit.</w:t>
+      </w:r>
+      <w:r>
+        <w:t xml:space="preserve"> Every decision, approval and question is written to an insert-only log that cannot be edited or deleted.</w:t>
+      </w:r>
+    </w:p>
+    <w:p>
+      <w:pPr>
+        <w:spacing w:after="200" w:before="40"/>
+        <w:ind w:left="280"/>
+      </w:pPr>
+      <w:r>
+        <w:rPr>
+          <w:b/>
+          <w:bCs/>
+          <w:color w:val="9C5700"/>
+          <w:sz w:val="19"/>
+          <w:szCs w:val="19"/>
+        </w:rPr>
+        <w:t xml:space="preserve">Today in the demo: </w:t>
+      </w:r>
+      <w:r>
+        <w:rPr>
+          <w:color w:val="595959"/>
+          <w:sz w:val="19"/>
+          <w:szCs w:val="19"/>
+        </w:rPr>
+        <w:t xml:space="preserve">the pipeline runs on Azure Databricks; the database is Neon (AWS) and the workflow engine, API and assistant run on a laptop. Production deploys into the bank's own Azure tenant in-region.</w:t>
+      </w:r>
+    </w:p>
+    <w:p>
+      <w:pPr>
+        <w:pStyle w:val="Heading1"/>
+      </w:pPr>
+      <w:r>
+        <w:t xml:space="preserve">3. Prepared answers to client questions</w:t>
+      </w:r>
+    </w:p>
+    <w:p>
+      <w:pPr>
+        <w:pStyle w:val="Heading2"/>
+      </w:pPr>
+      <w:r>
+        <w:t xml:space="preserve">"How does data come into your system?"</w:t>
+      </w:r>
+    </w:p>
+    <w:p>
+      <w:pPr>
+        <w:pBdr>
+          <w:left w:val="single" w:color="1F4E79" w:sz="18" w:space="10"/>
+        </w:pBdr>
+        <w:spacing w:after="120"/>
+        <w:ind w:left="280"/>
+      </w:pPr>
+      <w:r>
+        <w:t xml:space="preserve">"We pull from the bank's existing systems; we never write back to them. Core-banking extracts arrive as files in a landing folder and start the pipeline automatically. Other systems connect from the Data ingestion screen with read-only logins — the CRM today, and databases, APIs, S3 or Snowflake through the same screen. Credentials go straight into a vault, never into our database.</w:t>
+      </w:r>
+    </w:p>
+    <w:p>
+      <w:pPr>
+        <w:pBdr>
+          <w:left w:val="single" w:color="1F4E79" w:sz="18" w:space="10"/>
+        </w:pBdr>
+        <w:spacing w:after="120"/>
+        <w:ind w:left="280"/>
+      </w:pPr>
+      <w:r>
+        <w:t xml:space="preserve">Every delivery is checked before it's accepted: the wrong file, missing columns, or a file that would remove a large share of the records is stopped with a plain explanation. In production the historical archive comes across once as a bulk migration, each interface is documented in an interface catalogue with its field mapping, and a failed run raises an alert."</w:t>
+      </w:r>
+    </w:p>
+    <w:p>
+      <w:pPr>
+        <w:spacing w:after="200" w:before="40"/>
+        <w:ind w:left="280"/>
+      </w:pPr>
+      <w:r>
+        <w:rPr>
+          <w:b/>
+          <w:bCs/>
+          <w:color w:val="9C5700"/>
+          <w:sz w:val="19"/>
+          <w:szCs w:val="19"/>
+        </w:rPr>
+        <w:t xml:space="preserve">Today in the demo: </w:t>
+      </w:r>
+      <w:r>
+        <w:rPr>
+          <w:color w:val="595959"/>
+          <w:sz w:val="19"/>
+          <w:szCs w:val="19"/>
+        </w:rPr>
+        <w:t xml:space="preserve">CSV upload and Salesforce are live. The PostgreSQL, REST API, S3 and Snowflake cards save credentials but do not pull data yet. There is no alerting, no interface catalogue and no historical migration yet. Each upload replaces the previous file, so every delivery must be a full snapshot.</w:t>
+      </w:r>
+    </w:p>
+    <w:p>
+      <w:pPr>
+        <w:pStyle w:val="Heading2"/>
+      </w:pPr>
+      <w:r>
+        <w:t xml:space="preserve">"What does the infrastructure look like?"</w:t>
+      </w:r>
+    </w:p>
+    <w:p>
+      <w:pPr>
+        <w:pBdr>
+          <w:left w:val="single" w:color="1F4E79" w:sz="18" w:space="10"/>
+        </w:pBdr>
+        <w:spacing w:after="120"/>
+        <w:ind w:left="280"/>
+      </w:pPr>
+      <w:r>
+        <w:t xml:space="preserve">"Standard cloud services, nothing exotic. Four roles: </w:t>
+      </w:r>
+      <w:r>
+        <w:rPr>
+          <w:b/>
+          <w:bCs/>
+        </w:rPr>
+        <w:t xml:space="preserve">data processing</w:t>
+      </w:r>
+      <w:r>
+        <w:t xml:space="preserve"> on Azure Databricks serverless, which adds compute automatically; a </w:t>
+      </w:r>
+      <w:r>
+        <w:rPr>
+          <w:b/>
+          <w:bCs/>
+        </w:rPr>
+        <w:t xml:space="preserve">database</w:t>
+      </w:r>
+      <w:r>
+        <w:t xml:space="preserve"> node for PostgreSQL; </w:t>
+      </w:r>
+      <w:r>
+        <w:rPr>
+          <w:b/>
+          <w:bCs/>
+        </w:rPr>
+        <w:t xml:space="preserve">application</w:t>
+      </w:r>
+      <w:r>
+        <w:t xml:space="preserve"> services for the API, website and workflow engine on Kubernetes (AKS); and an optional </w:t>
+      </w:r>
+      <w:r>
+        <w:rPr>
+          <w:b/>
+          <w:bCs/>
+        </w:rPr>
+        <w:t xml:space="preserve">GPU</w:t>
+      </w:r>
+      <w:r>
+        <w:t xml:space="preserve"> for the assistant, which also runs on CPU. It scales by adding capacity, not by replacing the platform.</w:t>
+      </w:r>
+    </w:p>
+    <w:p>
+      <w:pPr>
+        <w:pBdr>
+          <w:left w:val="single" w:color="1F4E79" w:sz="18" w:space="10"/>
+        </w:pBdr>
+        <w:spacing w:after="120"/>
+        <w:ind w:left="280"/>
+      </w:pPr>
+      <w:r>
+        <w:t xml:space="preserve">We won't quote exact sizes today, because proper sizing needs the bank's volumes: countries, transactions per day, how much history to keep, runs per day and concurrent users. Give us those and we'll size Development, Test, Production and DR properly rather than guess."</w:t>
+      </w:r>
+    </w:p>
+    <w:p>
+      <w:pPr>
+        <w:pStyle w:val="ListParagraph"/>
+        <w:numPr>
+          <w:ilvl w:val="0"/>
+          <w:numId w:val="2"/>
+        </w:numPr>
+        <w:spacing w:after="60"/>
+      </w:pPr>
+      <w:r>
+        <w:t xml:space="preserve">If the bank requires its own data centre, the database, application and workflow layers run as containers on its Kubernetes (OpenShift or RKE2); the pipeline layer would need Azure Databricks or an on-premises Spark platform instead.</w:t>
+      </w:r>
+    </w:p>
+    <w:p>
+      <w:pPr>
+        <w:spacing w:after="200" w:before="40"/>
+        <w:ind w:left="280"/>
+      </w:pPr>
+      <w:r>
+        <w:rPr>
+          <w:b/>
+          <w:bCs/>
+          <w:color w:val="9C5700"/>
+          <w:sz w:val="19"/>
+          <w:szCs w:val="19"/>
+        </w:rPr>
+        <w:t xml:space="preserve">Today in the demo: </w:t>
+      </w:r>
+      <w:r>
+        <w:rPr>
+          <w:color w:val="595959"/>
+          <w:sz w:val="19"/>
+          <w:szCs w:val="19"/>
+        </w:rPr>
+        <w:t xml:space="preserve">one laptop plus Neon and Databricks; no HA or DR. Indicative costs are in section 9.</w:t>
+      </w:r>
+    </w:p>
+    <w:p>
+      <w:pPr>
+        <w:pStyle w:val="Heading2"/>
+      </w:pPr>
+      <w:r>
+        <w:t xml:space="preserve">"How is the data encrypted?"</w:t>
+      </w:r>
+    </w:p>
+    <w:p>
+      <w:pPr>
+        <w:pBdr>
+          <w:left w:val="single" w:color="1F4E79" w:sz="18" w:space="10"/>
+        </w:pBdr>
+        <w:spacing w:after="120"/>
+        <w:ind w:left="280"/>
+      </w:pPr>
+      <w:r>
+        <w:t xml:space="preserve">"In production everything is stored inside the bank's Azure tenant, in the region, and encrypted at rest — the database, the pipeline tables and the landed files — with keys the bank holds in its own Key Vault rather than in any configuration file. Traffic between components is TLS. Passwords are stored only as salted hashes, and connector credentials live in a vault. Nothing is written outside that boundary."</w:t>
+      </w:r>
+    </w:p>
+    <w:p>
+      <w:pPr>
+        <w:spacing w:after="200" w:before="40"/>
+        <w:ind w:left="280"/>
+      </w:pPr>
+      <w:r>
+        <w:rPr>
+          <w:b/>
+          <w:bCs/>
+          <w:color w:val="9C5700"/>
+          <w:sz w:val="19"/>
+          <w:szCs w:val="19"/>
+        </w:rPr>
+        <w:t xml:space="preserve">Today in the demo: </w:t>
+      </w:r>
+      <w:r>
+        <w:rPr>
+          <w:color w:val="595959"/>
+          <w:sz w:val="19"/>
+          <w:szCs w:val="19"/>
+        </w:rPr>
+        <w:t xml:space="preserve">database connections are TLS-encrypted; storage is encrypted with the providers' own keys; the browser link and the workflow engine are unencrypted on the laptop. Original files are overwritten by each new upload — production should keep each delivery unchanged, with a fingerprint, so any figure can be traced to the exact file received.</w:t>
+      </w:r>
+    </w:p>
+    <w:p>
+      <w:pPr>
+        <w:pStyle w:val="Heading2"/>
+      </w:pPr>
+      <w:r>
+        <w:t xml:space="preserve">"How is it secure?"</w:t>
+      </w:r>
+    </w:p>
+    <w:p>
+      <w:pPr>
+        <w:pBdr>
+          <w:left w:val="single" w:color="1F4E79" w:sz="18" w:space="10"/>
+        </w:pBdr>
+        <w:spacing w:after="120"/>
+        <w:ind w:left="280"/>
+      </w:pPr>
+      <w:r>
+        <w:t xml:space="preserve">"Four layers. </w:t>
+      </w:r>
+      <w:r>
+        <w:rPr>
+          <w:b/>
+          <w:bCs/>
+        </w:rPr>
+        <w:t xml:space="preserve">The data stays in the bank's region.</w:t>
+      </w:r>
+      <w:r>
+        <w:t xml:space="preserve"> </w:t>
+      </w:r>
+      <w:r>
+        <w:rPr>
+          <w:b/>
+          <w:bCs/>
+        </w:rPr>
+        <w:t xml:space="preserve">Access is by role</w:t>
+      </w:r>
+      <w:r>
+        <w:t xml:space="preserve">, checked on the server for every request, with maker-checker separation and a read-only auditor; production adds single sign-on with multi-factor login and access limited by country. </w:t>
+      </w:r>
+      <w:r>
+        <w:rPr>
+          <w:b/>
+          <w:bCs/>
+        </w:rPr>
+        <w:t xml:space="preserve">Everything is encrypted</w:t>
+      </w:r>
+      <w:r>
+        <w:t xml:space="preserve"> in transit and at rest. And </w:t>
+      </w:r>
+      <w:r>
+        <w:rPr>
+          <w:b/>
+          <w:bCs/>
+        </w:rPr>
+        <w:t xml:space="preserve">the audit log is insert-only</w:t>
+      </w:r>
+      <w:r>
+        <w:t xml:space="preserve"> — the database refuses edits and deletions — so you can show a regulator that the record was not altered."</w:t>
+      </w:r>
+    </w:p>
+    <w:p>
+      <w:pPr>
+        <w:spacing w:after="200" w:before="40"/>
+        <w:ind w:left="280"/>
+      </w:pPr>
+      <w:r>
+        <w:rPr>
+          <w:b/>
+          <w:bCs/>
+          <w:color w:val="9C5700"/>
+          <w:sz w:val="19"/>
+          <w:szCs w:val="19"/>
+        </w:rPr>
+        <w:t xml:space="preserve">Today in the demo: </w:t>
+      </w:r>
+      <w:r>
+        <w:rPr>
+          <w:color w:val="595959"/>
+          <w:sz w:val="19"/>
+          <w:szCs w:val="19"/>
+        </w:rPr>
+        <w:t xml:space="preserve">role checks and the insert-only audit log are built. There is no SSO or MFA, no login rate limit and no row-level access by country, and the workflow engine runs with security switched off. A hash-chained audit log, where each entry fingerprints the one before so any change is visible, would strengthen the tamper-evidence claim.</w:t>
+      </w:r>
+    </w:p>
+    <w:p>
+      <w:pPr>
+        <w:pStyle w:val="Heading2"/>
+      </w:pPr>
+      <w:r>
+        <w:t xml:space="preserve">"What's the AI, exactly?"</w:t>
+      </w:r>
+    </w:p>
+    <w:p>
+      <w:pPr>
+        <w:pBdr>
+          <w:left w:val="single" w:color="1F4E79" w:sz="18" w:space="10"/>
+        </w:pBdr>
+        <w:spacing w:after="120"/>
+        <w:ind w:left="280"/>
+      </w:pPr>
+      <w:r>
+        <w:t xml:space="preserve">"Three pieces, and none of them makes a decision. A </w:t>
+      </w:r>
+      <w:r>
+        <w:rPr>
+          <w:b/>
+          <w:bCs/>
+        </w:rPr>
+        <w:t xml:space="preserve">rules engine</w:t>
+      </w:r>
+      <w:r>
+        <w:t xml:space="preserve"> — 28 data-quality checks and 9 fraud and business rules — where every flag says which rule fired and why. A </w:t>
+      </w:r>
+      <w:r>
+        <w:rPr>
+          <w:b/>
+          <w:bCs/>
+        </w:rPr>
+        <w:t xml:space="preserve">matching step</w:t>
+      </w:r>
+      <w:r>
+        <w:t xml:space="preserve"> that finds companies recorded more than once, by cleaning names and scoring how similar they are; it proposes pairs and a person confirms, it never merges on its own. And a </w:t>
+      </w:r>
+      <w:r>
+        <w:rPr>
+          <w:b/>
+          <w:bCs/>
+        </w:rPr>
+        <w:t xml:space="preserve">language model running on the bank's own hardware</w:t>
+      </w:r>
+      <w:r>
+        <w:t xml:space="preserve"> that turns a plain-language question into one of an approved set of queries; the numbers come from the database, not the model, and every question is logged.</w:t>
+      </w:r>
+    </w:p>
+    <w:p>
+      <w:pPr>
+        <w:pBdr>
+          <w:left w:val="single" w:color="1F4E79" w:sz="18" w:space="10"/>
+        </w:pBdr>
+        <w:spacing w:after="120"/>
+        <w:ind w:left="280"/>
+      </w:pPr>
+      <w:r>
+        <w:t xml:space="preserve">A machine-learning anomaly score is designed as the next phase, and it will be a signal for a person to review, never a decision."</w:t>
+      </w:r>
+    </w:p>
+    <w:p>
+      <w:pPr>
+        <w:spacing w:after="200" w:before="40"/>
+        <w:ind w:left="280"/>
+      </w:pPr>
+      <w:r>
+        <w:rPr>
+          <w:b/>
+          <w:bCs/>
+          <w:color w:val="9C5700"/>
+          <w:sz w:val="19"/>
+          <w:szCs w:val="19"/>
+        </w:rPr>
+        <w:t xml:space="preserve">Today in the demo: </w:t>
+      </w:r>
+      <w:r>
+        <w:rPr>
+          <w:color w:val="595959"/>
+          <w:sz w:val="19"/>
+          <w:szCs w:val="19"/>
+        </w:rPr>
+        <w:t xml:space="preserve">this is mostly rules, not machine learning — say so rather than oversell. The assistant runs on a laptop CPU (about 3–6 seconds per question).</w:t>
+      </w:r>
+    </w:p>
+    <w:p>
+      <w:pPr>
+        <w:pStyle w:val="Heading1"/>
+      </w:pPr>
+      <w:r>
+        <w:t xml:space="preserve">4. Infrastructure</w:t>
+      </w:r>
+    </w:p>
+    <w:p>
+      <w:pPr>
+        <w:pStyle w:val="Heading2"/>
+      </w:pPr>
+      <w:r>
         <w:t xml:space="preserve">Today (proof of concept)</w:t>
       </w:r>
     </w:p>
@@ -319,7 +1004,7 @@
         <w:pStyle w:val="Heading1"/>
       </w:pPr>
       <w:r>
-        <w:t xml:space="preserve">3. Security</w:t>
+        <w:t xml:space="preserve">5. Security</w:t>
       </w:r>
     </w:p>
     <w:p>
@@ -473,7 +1158,7 @@
         <w:pStyle w:val="Heading1"/>
       </w:pPr>
       <w:r>
-        <w:t xml:space="preserve">4. Data encryption</w:t>
+        <w:t xml:space="preserve">6. Data encryption</w:t>
       </w:r>
     </w:p>
     <w:tbl>
@@ -900,7 +1585,7 @@
         <w:pStyle w:val="Heading1"/>
       </w:pPr>
       <w:r>
-        <w:t xml:space="preserve">5. Scalability</w:t>
+        <w:t xml:space="preserve">7. Scalability</w:t>
       </w:r>
     </w:p>
     <w:p>
@@ -1038,7 +1723,7 @@
         <w:pStyle w:val="Heading1"/>
       </w:pPr>
       <w:r>
-        <w:t xml:space="preserve">6. Performance as the data scales</w:t>
+        <w:t xml:space="preserve">8. Performance as the data scales</w:t>
       </w:r>
     </w:p>
     <w:p>
@@ -1046,7 +1731,7 @@
         <w:pStyle w:val="Heading2"/>
       </w:pPr>
       <w:r>
-        <w:t xml:space="preserve">6.1 Pipeline run time</w:t>
+        <w:t xml:space="preserve">8.1 Pipeline run time</w:t>
       </w:r>
     </w:p>
     <w:tbl>
@@ -1370,7 +2055,7 @@
         <w:pStyle w:val="Heading2"/>
       </w:pPr>
       <w:r>
-        <w:t xml:space="preserve">6.2 Where the time goes for 10,000 transactions</w:t>
+        <w:t xml:space="preserve">8.2 Where the time goes for 10,000 transactions</w:t>
       </w:r>
     </w:p>
     <w:tbl>
@@ -1885,7 +2570,7 @@
         <w:pStyle w:val="Heading2"/>
       </w:pPr>
       <w:r>
-        <w:t xml:space="preserve">6.3 What happens to a large dataset, step by step</w:t>
+        <w:t xml:space="preserve">8.3 What happens to a large dataset, step by step</w:t>
       </w:r>
     </w:p>
     <w:p>
@@ -2023,7 +2708,7 @@
         <w:pStyle w:val="Heading2"/>
       </w:pPr>
       <w:r>
-        <w:t xml:space="preserve">6.4 Workflow tasks and Camunda under load</w:t>
+        <w:t xml:space="preserve">8.4 Workflow tasks and Camunda under load</w:t>
       </w:r>
     </w:p>
     <w:tbl>
@@ -2412,7 +3097,7 @@
         <w:pStyle w:val="Heading2"/>
       </w:pPr>
       <w:r>
-        <w:t xml:space="preserve">6.5 Role of the current development PC</w:t>
+        <w:t xml:space="preserve">8.5 Role of the current development PC</w:t>
       </w:r>
     </w:p>
     <w:p>
@@ -2506,7 +3191,7 @@
         <w:pStyle w:val="Heading1"/>
       </w:pPr>
       <w:r>
-        <w:t xml:space="preserve">7. Hosting and costs (Azure UAE North, USD per month)</w:t>
+        <w:t xml:space="preserve">9. Hosting and costs (Azure UAE North, USD per month)</w:t>
       </w:r>
     </w:p>
     <w:tbl>
@@ -3557,7 +4242,7 @@
         <w:pStyle w:val="Heading1"/>
       </w:pPr>
       <w:r>
-        <w:t xml:space="preserve">8. Can the system handle large volumes?</w:t>
+        <w:t xml:space="preserve">10. Can the system handle large volumes?</w:t>
       </w:r>
     </w:p>
     <w:tbl>
@@ -3649,7 +4334,7 @@
                 <w:sz w:val="19"/>
                 <w:szCs w:val="19"/>
               </w:rPr>
-              <w:t xml:space="preserve">Hosted, after changes in section 9</w:t>
+              <w:t xml:space="preserve">Hosted, after changes in section 11</w:t>
             </w:r>
           </w:p>
         </w:tc>
@@ -3916,7 +4601,7 @@
         <w:pStyle w:val="Heading1"/>
       </w:pPr>
       <w:r>
-        <w:t xml:space="preserve">9. Changes needed before production volumes</w:t>
+        <w:t xml:space="preserve">11. Changes needed before production volumes</w:t>
       </w:r>
     </w:p>
     <w:p>
@@ -4104,7 +4789,7 @@
         <w:pStyle w:val="Heading1"/>
       </w:pPr>
       <w:r>
-        <w:t xml:space="preserve">10. Notes for client conversations</w:t>
+        <w:t xml:space="preserve">12. Notes for client conversations</w:t>
       </w:r>
     </w:p>
     <w:p>

</xml_diff>